<commit_message>
Add Practical 11 and improve screenshot quality.
- Added 4 new C++ practicals for Practical 11 (Function/Operator Overloading and Overriding).
- Improved screenshot quality of C++ outputs by increasing device scale factor and font size.
- Regenerated cpp_practicals_report.docx to include all 14 practicals.
- Cleaned up temporary build artifacts (student.dat, testFile.txt, etc.) from the repository.
- Maintained 25 HTML pages and their screenshots.
</commit_message>
<xml_diff>
--- a/cpp_practicals_report.docx
+++ b/cpp_practicals_report.docx
@@ -15,7 +15,7 @@
         <w:pStyle w:val="Heading1"/>
       </w:pPr>
       <w:r>
-        <w:t>P12 ThisPointer</w:t>
+        <w:t>P11 1 FunctionOverloading</w:t>
       </w:r>
     </w:p>
     <w:p>
@@ -32,47 +32,59 @@
         <w:br/>
         <w:t>using namespace std;</w:t>
         <w:br/>
-        <w:t>class Employee {</w:t>
+        <w:t>class Temp</w:t>
+        <w:br/>
+        <w:t>{</w:t>
+        <w:br/>
+        <w:t>private:</w:t>
+        <w:br/>
+        <w:t>int x = 10;</w:t>
+        <w:br/>
+        <w:t>double x1 = 10.1;</w:t>
         <w:br/>
         <w:t>public:</w:t>
         <w:br/>
-        <w:t>int id; //data member (also instance variable)</w:t>
-        <w:br/>
-        <w:t>string name; //data member(also instance variable)</w:t>
-        <w:br/>
-        <w:t>float salary;</w:t>
-        <w:br/>
-        <w:t>Employee(int id, string name, float salary)</w:t>
+        <w:t>void add(int y)</w:t>
         <w:br/>
         <w:t>{</w:t>
         <w:br/>
-        <w:t>this-&gt;id = id;</w:t>
-        <w:br/>
-        <w:t>this-&gt;name = name;</w:t>
-        <w:br/>
-        <w:t>this-&gt;salary = salary;</w:t>
+        <w:t>cout &lt;&lt; "Value of x + y is: " &lt;&lt; x + y &lt;&lt; endl;</w:t>
         <w:br/>
         <w:t>}</w:t>
         <w:br/>
-        <w:t>void display()</w:t>
+        <w:t>// Differ in the type of argument.</w:t>
+        <w:br/>
+        <w:t>void add(double d)</w:t>
         <w:br/>
         <w:t>{</w:t>
         <w:br/>
-        <w:t>cout&lt;&lt;id&lt;&lt;" "&lt;&lt;name&lt;&lt;" "&lt;&lt;salary&lt;&lt;endl;</w:t>
+        <w:t>cout &lt;&lt; "Value of x1 + d is: " &lt;&lt; x1 + d &lt;&lt; endl;</w:t>
         <w:br/>
         <w:t>}</w:t>
         <w:br/>
+        <w:t>// Differ in the number of arguments.</w:t>
+        <w:br/>
+        <w:t>void add(int y, int z)</w:t>
+        <w:br/>
+        <w:t>{</w:t>
+        <w:br/>
+        <w:t>cout &lt;&lt; "Value of x + y + z is: " &lt;&lt; x + y + z &lt;&lt; endl;</w:t>
+        <w:br/>
+        <w:t>}</w:t>
+        <w:br/>
         <w:t>};</w:t>
         <w:br/>
-        <w:t>int main(void) {</w:t>
-        <w:br/>
-        <w:t>Employee e1 =Employee(101, "Pinocchio", 890000); //creating an object of Employee</w:t>
-        <w:br/>
-        <w:t>Employee e2=Employee(102, "Naruto", 59000); //creating an object of Employee</w:t>
-        <w:br/>
-        <w:t>e1.display();</w:t>
-        <w:br/>
-        <w:t>e2.display();</w:t>
+        <w:t>int main()</w:t>
+        <w:br/>
+        <w:t>{</w:t>
+        <w:br/>
+        <w:t>Temp t1;</w:t>
+        <w:br/>
+        <w:t>t1.add(10);</w:t>
+        <w:br/>
+        <w:t>t1.add(11.1);</w:t>
+        <w:br/>
+        <w:t>t1.add(12,13);</w:t>
         <w:br/>
         <w:t>return 0;</w:t>
         <w:br/>
@@ -100,11 +112,639 @@
               <a:graphicData uri="http://schemas.openxmlformats.org/drawingml/2006/picture">
                 <pic:pic>
                   <pic:nvPicPr>
+                    <pic:cNvPr id="0" name="P11_1_FunctionOverloading.png"/>
+                    <pic:cNvPicPr/>
+                  </pic:nvPicPr>
+                  <pic:blipFill>
+                    <a:blip r:embed="rId10"/>
+                    <a:stretch>
+                      <a:fillRect/>
+                    </a:stretch>
+                  </pic:blipFill>
+                  <pic:spPr>
+                    <a:xfrm>
+                      <a:off x="0" y="0"/>
+                      <a:ext cx="5486400" cy="3086100"/>
+                    </a:xfrm>
+                    <a:prstGeom prst="rect"/>
+                  </pic:spPr>
+                </pic:pic>
+              </a:graphicData>
+            </a:graphic>
+          </wp:inline>
+        </w:drawing>
+      </w:r>
+    </w:p>
+    <w:p>
+      <w:r>
+        <w:br w:type="page"/>
+      </w:r>
+    </w:p>
+    <w:p>
+      <w:pPr>
+        <w:pStyle w:val="Heading1"/>
+      </w:pPr>
+      <w:r>
+        <w:t>P11 2 OperatorOverloading</w:t>
+      </w:r>
+    </w:p>
+    <w:p>
+      <w:pPr>
+        <w:pStyle w:val="Heading2"/>
+      </w:pPr>
+      <w:r>
+        <w:t>Source Code</w:t>
+      </w:r>
+    </w:p>
+    <w:p>
+      <w:r>
+        <w:t>#include &lt;iostream&gt;</w:t>
+        <w:br/>
+        <w:t>using namespace std;</w:t>
+        <w:br/>
+        <w:t>class Math</w:t>
+        <w:br/>
+        <w:t>{</w:t>
+        <w:br/>
+        <w:t>int num;</w:t>
+        <w:br/>
+        <w:t>public:</w:t>
+        <w:br/>
+        <w:t>// setter to set value</w:t>
+        <w:br/>
+        <w:t>void setValue(int val)</w:t>
+        <w:br/>
+        <w:t>{</w:t>
+        <w:br/>
+        <w:t>num = val;</w:t>
+        <w:br/>
+        <w:t>}</w:t>
+        <w:br/>
+        <w:t>// overloading + operator to add values in two objects</w:t>
+        <w:br/>
+        <w:t>Math operator + (Math &amp;obj) {</w:t>
+        <w:br/>
+        <w:t>Math temp;</w:t>
+        <w:br/>
+        <w:t>temp.num = num + obj.num;</w:t>
+        <w:br/>
+        <w:t>return (temp);</w:t>
+        <w:br/>
+        <w:t>}</w:t>
+        <w:br/>
+        <w:t>// overloading - operator to subtract values in two objects</w:t>
+        <w:br/>
+        <w:t>Math operator - (Math &amp;obj){</w:t>
+        <w:br/>
+        <w:t>Math temp;</w:t>
+        <w:br/>
+        <w:t>temp.num = num - obj.num;</w:t>
+        <w:br/>
+        <w:t>return (temp);</w:t>
+        <w:br/>
+        <w:t>}</w:t>
+        <w:br/>
+        <w:t>// overloading * operator to multiply values in two objects</w:t>
+        <w:br/>
+        <w:t>Math operator * (Math &amp;obj){</w:t>
+        <w:br/>
+        <w:t>Math temp;</w:t>
+        <w:br/>
+        <w:t>temp.num = num * obj.num;</w:t>
+        <w:br/>
+        <w:t>return (temp);</w:t>
+        <w:br/>
+        <w:t>}</w:t>
+        <w:br/>
+        <w:t>// overloading / operator to divide values in two objects</w:t>
+        <w:br/>
+        <w:t>Math operator / (Math &amp;obj){</w:t>
+        <w:br/>
+        <w:t>Math temp;</w:t>
+        <w:br/>
+        <w:t>temp.num = num / obj.num;</w:t>
+        <w:br/>
+        <w:t>return (temp);</w:t>
+        <w:br/>
+        <w:t>}</w:t>
+        <w:br/>
+        <w:t>// display result value getter</w:t>
+        <w:br/>
+        <w:t>void getValue(){cout &lt;&lt; num;</w:t>
+        <w:br/>
+        <w:t>}</w:t>
+        <w:br/>
+        <w:t>};</w:t>
+        <w:br/>
+        <w:t>int main ()</w:t>
+        <w:br/>
+        <w:t>{</w:t>
+        <w:br/>
+        <w:t>// created objects obj1 and obj2 to perform mathematical operations and resObj to store results</w:t>
+        <w:br/>
+        <w:t>Math obj1, obj2, resObj;</w:t>
+        <w:br/>
+        <w:t>// accepting the values</w:t>
+        <w:br/>
+        <w:t>obj1.setValue(20);</w:t>
+        <w:br/>
+        <w:t>obj2.setValue(10);</w:t>
+        <w:br/>
+        <w:t>cout &lt;&lt; "Obj 1: ";</w:t>
+        <w:br/>
+        <w:t>obj1.getValue();</w:t>
+        <w:br/>
+        <w:t>cout &lt;&lt; "\nObj 2: ";</w:t>
+        <w:br/>
+        <w:t>obj2.getValue();</w:t>
+        <w:br/>
+        <w:t>// assign result of obj1 and obj2 to resObj addition</w:t>
+        <w:br/>
+        <w:t>resObj = obj1 + obj2;</w:t>
+        <w:br/>
+        <w:t>cout &lt;&lt; "\n\nObj1 + Obj2 : " ;</w:t>
+        <w:br/>
+        <w:t>resObj.getValue();</w:t>
+        <w:br/>
+        <w:t>// subtraction</w:t>
+        <w:br/>
+        <w:t>resObj = obj1 - obj2;</w:t>
+        <w:br/>
+        <w:t>cout &lt;&lt; "\nObj1 - Obj2 : " ;</w:t>
+        <w:br/>
+        <w:t>resObj.getValue();</w:t>
+        <w:br/>
+        <w:t>// multiplication</w:t>
+        <w:br/>
+        <w:t>resObj = obj1 * obj2;</w:t>
+        <w:br/>
+        <w:t>cout &lt;&lt; "\nObj1 * Obj2 : " ;</w:t>
+        <w:br/>
+        <w:t>resObj.getValue();</w:t>
+        <w:br/>
+        <w:t>// division</w:t>
+        <w:br/>
+        <w:t>resObj = obj1 / obj2;</w:t>
+        <w:br/>
+        <w:t>cout &lt;&lt; "\nObj1 / Obj2 : " ;</w:t>
+        <w:br/>
+        <w:t>resObj.getValue();</w:t>
+        <w:br/>
+        <w:t>return 0;</w:t>
+        <w:br/>
+        <w:t>}</w:t>
+      </w:r>
+    </w:p>
+    <w:p>
+      <w:pPr>
+        <w:pStyle w:val="Heading2"/>
+      </w:pPr>
+      <w:r>
+        <w:t>Output Screenshot</w:t>
+      </w:r>
+    </w:p>
+    <w:p>
+      <w:r>
+        <w:drawing>
+          <wp:inline xmlns:a="http://schemas.openxmlformats.org/drawingml/2006/main" xmlns:pic="http://schemas.openxmlformats.org/drawingml/2006/picture">
+            <wp:extent cx="5486400" cy="3086100"/>
+            <wp:docPr id="2" name="Picture 2"/>
+            <wp:cNvGraphicFramePr>
+              <a:graphicFrameLocks noChangeAspect="1"/>
+            </wp:cNvGraphicFramePr>
+            <a:graphic>
+              <a:graphicData uri="http://schemas.openxmlformats.org/drawingml/2006/picture">
+                <pic:pic>
+                  <pic:nvPicPr>
+                    <pic:cNvPr id="0" name="P11_2_OperatorOverloading.png"/>
+                    <pic:cNvPicPr/>
+                  </pic:nvPicPr>
+                  <pic:blipFill>
+                    <a:blip r:embed="rId11"/>
+                    <a:stretch>
+                      <a:fillRect/>
+                    </a:stretch>
+                  </pic:blipFill>
+                  <pic:spPr>
+                    <a:xfrm>
+                      <a:off x="0" y="0"/>
+                      <a:ext cx="5486400" cy="3086100"/>
+                    </a:xfrm>
+                    <a:prstGeom prst="rect"/>
+                  </pic:spPr>
+                </pic:pic>
+              </a:graphicData>
+            </a:graphic>
+          </wp:inline>
+        </w:drawing>
+      </w:r>
+    </w:p>
+    <w:p>
+      <w:r>
+        <w:br w:type="page"/>
+      </w:r>
+    </w:p>
+    <w:p>
+      <w:pPr>
+        <w:pStyle w:val="Heading1"/>
+      </w:pPr>
+      <w:r>
+        <w:t>P11 3 FunctionOverriding</w:t>
+      </w:r>
+    </w:p>
+    <w:p>
+      <w:pPr>
+        <w:pStyle w:val="Heading2"/>
+      </w:pPr>
+      <w:r>
+        <w:t>Source Code</w:t>
+      </w:r>
+    </w:p>
+    <w:p>
+      <w:r>
+        <w:t>#include &lt;iostream&gt;</w:t>
+        <w:br/>
+        <w:t>using namespace std;</w:t>
+        <w:br/>
+        <w:t>class Exam { // base class declaration.</w:t>
+        <w:br/>
+        <w:t>public:</w:t>
+        <w:br/>
+        <w:t>void colorP(){</w:t>
+        <w:br/>
+        <w:t>cout&lt;&lt;"Black";</w:t>
+        <w:br/>
+        <w:t>}</w:t>
+        <w:br/>
+        <w:t>};</w:t>
+        <w:br/>
+        <w:t>class Atkt: public Exam // inheriting Exam class.</w:t>
+        <w:br/>
+        <w:t>{</w:t>
+        <w:br/>
+        <w:t>public:</w:t>
+        <w:br/>
+        <w:t>void colorP(){</w:t>
+        <w:br/>
+        <w:t>cout&lt;&lt;"Grey";</w:t>
+        <w:br/>
+        <w:t>}</w:t>
+        <w:br/>
+        <w:t>};</w:t>
+        <w:br/>
+        <w:t>int main(void) {</w:t>
+        <w:br/>
+        <w:t>Atkt kt;</w:t>
+        <w:br/>
+        <w:t>kt.colorP();</w:t>
+        <w:br/>
+        <w:t>}</w:t>
+      </w:r>
+    </w:p>
+    <w:p>
+      <w:pPr>
+        <w:pStyle w:val="Heading2"/>
+      </w:pPr>
+      <w:r>
+        <w:t>Output Screenshot</w:t>
+      </w:r>
+    </w:p>
+    <w:p>
+      <w:r>
+        <w:drawing>
+          <wp:inline xmlns:a="http://schemas.openxmlformats.org/drawingml/2006/main" xmlns:pic="http://schemas.openxmlformats.org/drawingml/2006/picture">
+            <wp:extent cx="5486400" cy="3086100"/>
+            <wp:docPr id="3" name="Picture 3"/>
+            <wp:cNvGraphicFramePr>
+              <a:graphicFrameLocks noChangeAspect="1"/>
+            </wp:cNvGraphicFramePr>
+            <a:graphic>
+              <a:graphicData uri="http://schemas.openxmlformats.org/drawingml/2006/picture">
+                <pic:pic>
+                  <pic:nvPicPr>
+                    <pic:cNvPr id="0" name="P11_3_FunctionOverriding.png"/>
+                    <pic:cNvPicPr/>
+                  </pic:nvPicPr>
+                  <pic:blipFill>
+                    <a:blip r:embed="rId12"/>
+                    <a:stretch>
+                      <a:fillRect/>
+                    </a:stretch>
+                  </pic:blipFill>
+                  <pic:spPr>
+                    <a:xfrm>
+                      <a:off x="0" y="0"/>
+                      <a:ext cx="5486400" cy="3086100"/>
+                    </a:xfrm>
+                    <a:prstGeom prst="rect"/>
+                  </pic:spPr>
+                </pic:pic>
+              </a:graphicData>
+            </a:graphic>
+          </wp:inline>
+        </w:drawing>
+      </w:r>
+    </w:p>
+    <w:p>
+      <w:r>
+        <w:br w:type="page"/>
+      </w:r>
+    </w:p>
+    <w:p>
+      <w:pPr>
+        <w:pStyle w:val="Heading1"/>
+      </w:pPr>
+      <w:r>
+        <w:t>P11 4 PureVirtualFunction</w:t>
+      </w:r>
+    </w:p>
+    <w:p>
+      <w:pPr>
+        <w:pStyle w:val="Heading2"/>
+      </w:pPr>
+      <w:r>
+        <w:t>Source Code</w:t>
+      </w:r>
+    </w:p>
+    <w:p>
+      <w:r>
+        <w:t>#include &lt;iostream&gt;</w:t>
+        <w:br/>
+        <w:t>using namespace std;</w:t>
+        <w:br/>
+        <w:t>// Abstract class</w:t>
+        <w:br/>
+        <w:t>class Shape</w:t>
+        <w:br/>
+        <w:t>{</w:t>
+        <w:br/>
+        <w:t>public:</w:t>
+        <w:br/>
+        <w:t>virtual float calculateArea() = 0; // pure virtual function.</w:t>
+        <w:br/>
+        <w:t>};</w:t>
+        <w:br/>
+        <w:t>class Square : public Shape</w:t>
+        <w:br/>
+        <w:t>{</w:t>
+        <w:br/>
+        <w:t>float a;</w:t>
+        <w:br/>
+        <w:t>public:</w:t>
+        <w:br/>
+        <w:t>Square(float l)</w:t>
+        <w:br/>
+        <w:t>{</w:t>
+        <w:br/>
+        <w:t>a = l;</w:t>
+        <w:br/>
+        <w:t>}</w:t>
+        <w:br/>
+        <w:t>float calculateArea()</w:t>
+        <w:br/>
+        <w:t>{</w:t>
+        <w:br/>
+        <w:t>return a*a;</w:t>
+        <w:br/>
+        <w:t>}</w:t>
+        <w:br/>
+        <w:t>};</w:t>
+        <w:br/>
+        <w:t>class Circle : public Shape</w:t>
+        <w:br/>
+        <w:t>{</w:t>
+        <w:br/>
+        <w:t>float r;</w:t>
+        <w:br/>
+        <w:t>public:</w:t>
+        <w:br/>
+        <w:t>Circle(float x)</w:t>
+        <w:br/>
+        <w:t>{</w:t>
+        <w:br/>
+        <w:t>r = x;</w:t>
+        <w:br/>
+        <w:t>}</w:t>
+        <w:br/>
+        <w:t>float calculateArea()</w:t>
+        <w:br/>
+        <w:t>{</w:t>
+        <w:br/>
+        <w:t>return 3.14*r*r ;</w:t>
+        <w:br/>
+        <w:t>}</w:t>
+        <w:br/>
+        <w:t>};</w:t>
+        <w:br/>
+        <w:t>class Rectangle : public Shape</w:t>
+        <w:br/>
+        <w:t>{</w:t>
+        <w:br/>
+        <w:t>float l;</w:t>
+        <w:br/>
+        <w:t>float b;</w:t>
+        <w:br/>
+        <w:t>public:</w:t>
+        <w:br/>
+        <w:t>Rectangle(float x, float y)</w:t>
+        <w:br/>
+        <w:t>{</w:t>
+        <w:br/>
+        <w:t>l=x;</w:t>
+        <w:br/>
+        <w:t>b=y;</w:t>
+        <w:br/>
+        <w:t>}</w:t>
+        <w:br/>
+        <w:t>float calculateArea()</w:t>
+        <w:br/>
+        <w:t>{</w:t>
+        <w:br/>
+        <w:t>return l*b;</w:t>
+        <w:br/>
+        <w:t>}</w:t>
+        <w:br/>
+        <w:t>};</w:t>
+        <w:br/>
+        <w:t>int main()</w:t>
+        <w:br/>
+        <w:t>{</w:t>
+        <w:br/>
+        <w:t>Shape *shape;</w:t>
+        <w:br/>
+        <w:t>Square s(3.4);</w:t>
+        <w:br/>
+        <w:t>Rectangle r(5,6);</w:t>
+        <w:br/>
+        <w:t>Circle c(7.8);</w:t>
+        <w:br/>
+        <w:t>shape =&amp;s;</w:t>
+        <w:br/>
+        <w:t>int a1 =shape-&gt;calculateArea();</w:t>
+        <w:br/>
+        <w:t>shape = &amp;r;</w:t>
+        <w:br/>
+        <w:t>int a2 = shape-&gt;calculateArea();</w:t>
+        <w:br/>
+        <w:t>shape = &amp;c;</w:t>
+        <w:br/>
+        <w:t>int a3 = shape-&gt;calculateArea();</w:t>
+        <w:br/>
+        <w:t>cout &lt;&lt; "Area of the square is " &lt;&lt;a1&lt;&lt; endl;</w:t>
+        <w:br/>
+        <w:t>cout &lt;&lt; "Area of the rectangle is " &lt;&lt;a2&lt;&lt; endl;</w:t>
+        <w:br/>
+        <w:t>cout &lt;&lt; "Area of the circle is " &lt;&lt;a3&lt;&lt;endl;</w:t>
+        <w:br/>
+        <w:t>return 0;</w:t>
+        <w:br/>
+        <w:t>}</w:t>
+      </w:r>
+    </w:p>
+    <w:p>
+      <w:pPr>
+        <w:pStyle w:val="Heading2"/>
+      </w:pPr>
+      <w:r>
+        <w:t>Output Screenshot</w:t>
+      </w:r>
+    </w:p>
+    <w:p>
+      <w:r>
+        <w:drawing>
+          <wp:inline xmlns:a="http://schemas.openxmlformats.org/drawingml/2006/main" xmlns:pic="http://schemas.openxmlformats.org/drawingml/2006/picture">
+            <wp:extent cx="5486400" cy="3086100"/>
+            <wp:docPr id="4" name="Picture 4"/>
+            <wp:cNvGraphicFramePr>
+              <a:graphicFrameLocks noChangeAspect="1"/>
+            </wp:cNvGraphicFramePr>
+            <a:graphic>
+              <a:graphicData uri="http://schemas.openxmlformats.org/drawingml/2006/picture">
+                <pic:pic>
+                  <pic:nvPicPr>
+                    <pic:cNvPr id="0" name="P11_4_PureVirtualFunction.png"/>
+                    <pic:cNvPicPr/>
+                  </pic:nvPicPr>
+                  <pic:blipFill>
+                    <a:blip r:embed="rId13"/>
+                    <a:stretch>
+                      <a:fillRect/>
+                    </a:stretch>
+                  </pic:blipFill>
+                  <pic:spPr>
+                    <a:xfrm>
+                      <a:off x="0" y="0"/>
+                      <a:ext cx="5486400" cy="3086100"/>
+                    </a:xfrm>
+                    <a:prstGeom prst="rect"/>
+                  </pic:spPr>
+                </pic:pic>
+              </a:graphicData>
+            </a:graphic>
+          </wp:inline>
+        </w:drawing>
+      </w:r>
+    </w:p>
+    <w:p>
+      <w:r>
+        <w:br w:type="page"/>
+      </w:r>
+    </w:p>
+    <w:p>
+      <w:pPr>
+        <w:pStyle w:val="Heading1"/>
+      </w:pPr>
+      <w:r>
+        <w:t>P12 ThisPointer</w:t>
+      </w:r>
+    </w:p>
+    <w:p>
+      <w:pPr>
+        <w:pStyle w:val="Heading2"/>
+      </w:pPr>
+      <w:r>
+        <w:t>Source Code</w:t>
+      </w:r>
+    </w:p>
+    <w:p>
+      <w:r>
+        <w:t>#include &lt;iostream&gt;</w:t>
+        <w:br/>
+        <w:t>using namespace std;</w:t>
+        <w:br/>
+        <w:t>class Employee {</w:t>
+        <w:br/>
+        <w:t>public:</w:t>
+        <w:br/>
+        <w:t>int id; //data member (also instance variable)</w:t>
+        <w:br/>
+        <w:t>string name; //data member(also instance variable)</w:t>
+        <w:br/>
+        <w:t>float salary;</w:t>
+        <w:br/>
+        <w:t>Employee(int id, string name, float salary)</w:t>
+        <w:br/>
+        <w:t>{</w:t>
+        <w:br/>
+        <w:t>this-&gt;id = id;</w:t>
+        <w:br/>
+        <w:t>this-&gt;name = name;</w:t>
+        <w:br/>
+        <w:t>this-&gt;salary = salary;</w:t>
+        <w:br/>
+        <w:t>}</w:t>
+        <w:br/>
+        <w:t>void display()</w:t>
+        <w:br/>
+        <w:t>{</w:t>
+        <w:br/>
+        <w:t>cout&lt;&lt;id&lt;&lt;" "&lt;&lt;name&lt;&lt;" "&lt;&lt;salary&lt;&lt;endl;</w:t>
+        <w:br/>
+        <w:t>}</w:t>
+        <w:br/>
+        <w:t>};</w:t>
+        <w:br/>
+        <w:t>int main(void) {</w:t>
+        <w:br/>
+        <w:t>Employee e1 =Employee(101, "Pinocchio", 890000); //creating an object of Employee</w:t>
+        <w:br/>
+        <w:t>Employee e2=Employee(102, "Naruto", 59000); //creating an object of Employee</w:t>
+        <w:br/>
+        <w:t>e1.display();</w:t>
+        <w:br/>
+        <w:t>e2.display();</w:t>
+        <w:br/>
+        <w:t>return 0;</w:t>
+        <w:br/>
+        <w:t>}</w:t>
+      </w:r>
+    </w:p>
+    <w:p>
+      <w:pPr>
+        <w:pStyle w:val="Heading2"/>
+      </w:pPr>
+      <w:r>
+        <w:t>Output Screenshot</w:t>
+      </w:r>
+    </w:p>
+    <w:p>
+      <w:r>
+        <w:drawing>
+          <wp:inline xmlns:a="http://schemas.openxmlformats.org/drawingml/2006/main" xmlns:pic="http://schemas.openxmlformats.org/drawingml/2006/picture">
+            <wp:extent cx="5486400" cy="3086100"/>
+            <wp:docPr id="5" name="Picture 5"/>
+            <wp:cNvGraphicFramePr>
+              <a:graphicFrameLocks noChangeAspect="1"/>
+            </wp:cNvGraphicFramePr>
+            <a:graphic>
+              <a:graphicData uri="http://schemas.openxmlformats.org/drawingml/2006/picture">
+                <pic:pic>
+                  <pic:nvPicPr>
                     <pic:cNvPr id="0" name="P12_ThisPointer.png"/>
                     <pic:cNvPicPr/>
                   </pic:nvPicPr>
                   <pic:blipFill>
-                    <a:blip r:embed="rId10"/>
+                    <a:blip r:embed="rId14"/>
                     <a:stretch>
                       <a:fillRect/>
                     </a:stretch>
@@ -194,7 +834,7 @@
         <w:drawing>
           <wp:inline xmlns:a="http://schemas.openxmlformats.org/drawingml/2006/main" xmlns:pic="http://schemas.openxmlformats.org/drawingml/2006/picture">
             <wp:extent cx="5486400" cy="3086100"/>
-            <wp:docPr id="2" name="Picture 2"/>
+            <wp:docPr id="6" name="Picture 6"/>
             <wp:cNvGraphicFramePr>
               <a:graphicFrameLocks noChangeAspect="1"/>
             </wp:cNvGraphicFramePr>
@@ -206,7 +846,7 @@
                     <pic:cNvPicPr/>
                   </pic:nvPicPr>
                   <pic:blipFill>
-                    <a:blip r:embed="rId11"/>
+                    <a:blip r:embed="rId15"/>
                     <a:stretch>
                       <a:fillRect/>
                     </a:stretch>
@@ -296,7 +936,7 @@
         <w:drawing>
           <wp:inline xmlns:a="http://schemas.openxmlformats.org/drawingml/2006/main" xmlns:pic="http://schemas.openxmlformats.org/drawingml/2006/picture">
             <wp:extent cx="5486400" cy="3086100"/>
-            <wp:docPr id="3" name="Picture 3"/>
+            <wp:docPr id="7" name="Picture 7"/>
             <wp:cNvGraphicFramePr>
               <a:graphicFrameLocks noChangeAspect="1"/>
             </wp:cNvGraphicFramePr>
@@ -308,7 +948,7 @@
                     <pic:cNvPicPr/>
                   </pic:nvPicPr>
                   <pic:blipFill>
-                    <a:blip r:embed="rId12"/>
+                    <a:blip r:embed="rId16"/>
                     <a:stretch>
                       <a:fillRect/>
                     </a:stretch>
@@ -404,7 +1044,7 @@
         <w:drawing>
           <wp:inline xmlns:a="http://schemas.openxmlformats.org/drawingml/2006/main" xmlns:pic="http://schemas.openxmlformats.org/drawingml/2006/picture">
             <wp:extent cx="5486400" cy="3086100"/>
-            <wp:docPr id="4" name="Picture 4"/>
+            <wp:docPr id="8" name="Picture 8"/>
             <wp:cNvGraphicFramePr>
               <a:graphicFrameLocks noChangeAspect="1"/>
             </wp:cNvGraphicFramePr>
@@ -416,7 +1056,7 @@
                     <pic:cNvPicPr/>
                   </pic:nvPicPr>
                   <pic:blipFill>
-                    <a:blip r:embed="rId13"/>
+                    <a:blip r:embed="rId17"/>
                     <a:stretch>
                       <a:fillRect/>
                     </a:stretch>
@@ -510,7 +1150,7 @@
         <w:drawing>
           <wp:inline xmlns:a="http://schemas.openxmlformats.org/drawingml/2006/main" xmlns:pic="http://schemas.openxmlformats.org/drawingml/2006/picture">
             <wp:extent cx="5486400" cy="3086100"/>
-            <wp:docPr id="5" name="Picture 5"/>
+            <wp:docPr id="9" name="Picture 9"/>
             <wp:cNvGraphicFramePr>
               <a:graphicFrameLocks noChangeAspect="1"/>
             </wp:cNvGraphicFramePr>
@@ -522,7 +1162,7 @@
                     <pic:cNvPicPr/>
                   </pic:nvPicPr>
                   <pic:blipFill>
-                    <a:blip r:embed="rId14"/>
+                    <a:blip r:embed="rId18"/>
                     <a:stretch>
                       <a:fillRect/>
                     </a:stretch>
@@ -620,7 +1260,7 @@
         <w:drawing>
           <wp:inline xmlns:a="http://schemas.openxmlformats.org/drawingml/2006/main" xmlns:pic="http://schemas.openxmlformats.org/drawingml/2006/picture">
             <wp:extent cx="5486400" cy="3086100"/>
-            <wp:docPr id="6" name="Picture 6"/>
+            <wp:docPr id="10" name="Picture 10"/>
             <wp:cNvGraphicFramePr>
               <a:graphicFrameLocks noChangeAspect="1"/>
             </wp:cNvGraphicFramePr>
@@ -632,7 +1272,7 @@
                     <pic:cNvPicPr/>
                   </pic:nvPicPr>
                   <pic:blipFill>
-                    <a:blip r:embed="rId15"/>
+                    <a:blip r:embed="rId19"/>
                     <a:stretch>
                       <a:fillRect/>
                     </a:stretch>
@@ -729,7 +1369,7 @@
         <w:drawing>
           <wp:inline xmlns:a="http://schemas.openxmlformats.org/drawingml/2006/main" xmlns:pic="http://schemas.openxmlformats.org/drawingml/2006/picture">
             <wp:extent cx="5486400" cy="3086100"/>
-            <wp:docPr id="7" name="Picture 7"/>
+            <wp:docPr id="11" name="Picture 11"/>
             <wp:cNvGraphicFramePr>
               <a:graphicFrameLocks noChangeAspect="1"/>
             </wp:cNvGraphicFramePr>
@@ -741,7 +1381,7 @@
                     <pic:cNvPicPr/>
                   </pic:nvPicPr>
                   <pic:blipFill>
-                    <a:blip r:embed="rId16"/>
+                    <a:blip r:embed="rId20"/>
                     <a:stretch>
                       <a:fillRect/>
                     </a:stretch>
@@ -830,7 +1470,7 @@
         <w:drawing>
           <wp:inline xmlns:a="http://schemas.openxmlformats.org/drawingml/2006/main" xmlns:pic="http://schemas.openxmlformats.org/drawingml/2006/picture">
             <wp:extent cx="5486400" cy="3086100"/>
-            <wp:docPr id="8" name="Picture 8"/>
+            <wp:docPr id="12" name="Picture 12"/>
             <wp:cNvGraphicFramePr>
               <a:graphicFrameLocks noChangeAspect="1"/>
             </wp:cNvGraphicFramePr>
@@ -842,7 +1482,7 @@
                     <pic:cNvPicPr/>
                   </pic:nvPicPr>
                   <pic:blipFill>
-                    <a:blip r:embed="rId17"/>
+                    <a:blip r:embed="rId21"/>
                     <a:stretch>
                       <a:fillRect/>
                     </a:stretch>
@@ -934,7 +1574,7 @@
         <w:drawing>
           <wp:inline xmlns:a="http://schemas.openxmlformats.org/drawingml/2006/main" xmlns:pic="http://schemas.openxmlformats.org/drawingml/2006/picture">
             <wp:extent cx="5486400" cy="3086100"/>
-            <wp:docPr id="9" name="Picture 9"/>
+            <wp:docPr id="13" name="Picture 13"/>
             <wp:cNvGraphicFramePr>
               <a:graphicFrameLocks noChangeAspect="1"/>
             </wp:cNvGraphicFramePr>
@@ -946,7 +1586,7 @@
                     <pic:cNvPicPr/>
                   </pic:nvPicPr>
                   <pic:blipFill>
-                    <a:blip r:embed="rId18"/>
+                    <a:blip r:embed="rId22"/>
                     <a:stretch>
                       <a:fillRect/>
                     </a:stretch>
@@ -1095,7 +1735,7 @@
         <w:drawing>
           <wp:inline xmlns:a="http://schemas.openxmlformats.org/drawingml/2006/main" xmlns:pic="http://schemas.openxmlformats.org/drawingml/2006/picture">
             <wp:extent cx="5486400" cy="3086100"/>
-            <wp:docPr id="10" name="Picture 10"/>
+            <wp:docPr id="14" name="Picture 14"/>
             <wp:cNvGraphicFramePr>
               <a:graphicFrameLocks noChangeAspect="1"/>
             </wp:cNvGraphicFramePr>
@@ -1107,7 +1747,7 @@
                     <pic:cNvPicPr/>
                   </pic:nvPicPr>
                   <pic:blipFill>
-                    <a:blip r:embed="rId19"/>
+                    <a:blip r:embed="rId23"/>
                     <a:stretch>
                       <a:fillRect/>
                     </a:stretch>

</xml_diff>